<commit_message>
Actualizar los 7 productos formales con todo lo construido después: Spark real, Airflow, tuning, estándares SQL, SSRS, autoevaluación, GraphFrames, Delta Lake y datos reales de SEACE - Producto 7 (Informe Final) consolida la mayoría, 2-6 reciben actualizaciones puntuales
</commit_message>
<xml_diff>
--- a/reporte/productos_formales/Producto_01_Plan_de_Trabajo.docx
+++ b/reporte/productos_formales/Producto_01_Plan_de_Trabajo.docx
@@ -965,6 +965,18 @@
           <w:szCs w:val="21"/>
         </w:rPr>
         <w:t xml:space="preserve">Transversal: análisis de vínculos proveedor-funcionario (numeral 4.2.4) y documentación de linaje de datos (checklist Anexo 3).</w:t>
+      </w:r>
+    </w:p>
+    <w:p>
+      <w:pPr>
+        <w:spacing w:after="140"/>
+      </w:pPr>
+      <w:r>
+        <w:rPr>
+          <w:sz w:val="21"/>
+          <w:szCs w:val="21"/>
+        </w:rPr>
+        <w:t xml:space="preserve">Actualización: la orquestación de estas actividades se implementó y ejecutó realmente con Apache Airflow — dos DAGs reales (modulo_analisis_datos_1_8_2 y monitoreo_reentrenamiento_1_8_2), no solo planificados en este documento. Ver Producto 7, Sección 5, para el detalle y la evidencia de ejecución.</w:t>
       </w:r>
     </w:p>
     <w:p>

</xml_diff>